<commit_message>
Projektantrag als PDF Final
</commit_message>
<xml_diff>
--- a/documentation/Projektantrag_DavidW.docx
+++ b/documentation/Projektantrag_DavidW.docx
@@ -187,14 +187,21 @@
           <w:sz w:val="24"/>
           <w:szCs w:val="24"/>
         </w:rPr>
-        <w:t>wählen. Jede</w:t>
-      </w:r>
-      <w:r>
-        <w:rPr>
-          <w:sz w:val="24"/>
-          <w:szCs w:val="24"/>
-        </w:rPr>
-        <w:t xml:space="preserve"> Entscheidung beeinflusst den weiteren Verlauf der Handlung. Man kann entweder verlieren oder gewinnen. Wenn man verliert, ist es Game Over. Wenn man jedoch gewinnt, kann man durch die Entscheidungen entweder ein gutes oder ein schlechtes Ende erreichen. Dafür erhält man ein Achievement. Das Ziel ist es, alle Achievements zu erhalten.</w:t>
+        <w:t xml:space="preserve">wählen. Jede Entscheidung beeinflusst den weiteren Verlauf der Handlung. Man kann entweder verlieren oder gewinnen. Wenn man verliert, </w:t>
+      </w:r>
+      <w:r>
+        <w:rPr>
+          <w:sz w:val="24"/>
+          <w:szCs w:val="24"/>
+        </w:rPr>
+        <w:t>bedeutet das</w:t>
+      </w:r>
+      <w:r>
+        <w:rPr>
+          <w:sz w:val="24"/>
+          <w:szCs w:val="24"/>
+        </w:rPr>
+        <w:t xml:space="preserve"> Game Over. Wenn man jedoch gewinnt, kann man durch die Entscheidungen entweder ein gutes oder ein schlechtes Ende erreichen. Dafür erhält man ein Achievement. Das Ziel ist es, alle Achievements zu erhalten.</w:t>
       </w:r>
     </w:p>
     <w:p>
@@ -434,7 +441,7 @@
           <w:szCs w:val="24"/>
         </w:rPr>
         <w:drawing>
-          <wp:anchor distT="0" distB="0" distL="114300" distR="114300" simplePos="0" relativeHeight="251658240" behindDoc="1" locked="0" layoutInCell="1" allowOverlap="1" wp14:anchorId="421E7020" wp14:editId="2B503BCC">
+          <wp:anchor distT="0" distB="0" distL="114300" distR="114300" simplePos="0" relativeHeight="251658240" behindDoc="1" locked="0" layoutInCell="1" allowOverlap="1" wp14:anchorId="421E7020" wp14:editId="47D69E3D">
             <wp:simplePos x="0" y="0"/>
             <wp:positionH relativeFrom="margin">
               <wp:align>left</wp:align>
@@ -625,14 +632,42 @@
           <w:sz w:val="24"/>
           <w:szCs w:val="24"/>
         </w:rPr>
-        <w:t>Im Zentralen Fenster soll ein Bild passend zu</w:t>
-      </w:r>
-      <w:r>
-        <w:rPr>
-          <w:sz w:val="24"/>
-          <w:szCs w:val="24"/>
-        </w:rPr>
-        <w:t>r Situation sein zusammen mit dem Text</w:t>
+        <w:t xml:space="preserve">Im </w:t>
+      </w:r>
+      <w:r>
+        <w:rPr>
+          <w:sz w:val="24"/>
+          <w:szCs w:val="24"/>
+        </w:rPr>
+        <w:t>z</w:t>
+      </w:r>
+      <w:r>
+        <w:rPr>
+          <w:sz w:val="24"/>
+          <w:szCs w:val="24"/>
+        </w:rPr>
+        <w:t>entralen Fenster soll ein Bild passend zu</w:t>
+      </w:r>
+      <w:r>
+        <w:rPr>
+          <w:sz w:val="24"/>
+          <w:szCs w:val="24"/>
+        </w:rPr>
+        <w:t>r Situation</w:t>
+      </w:r>
+      <w:r>
+        <w:rPr>
+          <w:sz w:val="24"/>
+          <w:szCs w:val="24"/>
+        </w:rPr>
+        <w:t>,</w:t>
+      </w:r>
+      <w:r>
+        <w:rPr>
+          <w:sz w:val="24"/>
+          <w:szCs w:val="24"/>
+        </w:rPr>
+        <w:t xml:space="preserve"> zusammen mit dem Text</w:t>
       </w:r>
       <w:r>
         <w:rPr>
@@ -719,28 +754,21 @@
       </w:r>
     </w:p>
     <w:p>
-      <w:pPr>
-        <w:rPr>
-          <w:sz w:val="24"/>
-          <w:szCs w:val="24"/>
-        </w:rPr>
-      </w:pPr>
-      <w:r>
-        <w:rPr>
-          <w:sz w:val="24"/>
-          <w:szCs w:val="24"/>
-        </w:rPr>
-        <w:t>Leute aus der Klasse und meine Familie</w:t>
-      </w:r>
-      <w:r>
-        <w:rPr>
-          <w:sz w:val="24"/>
-          <w:szCs w:val="24"/>
-        </w:rPr>
-        <w:t>.</w:t>
-      </w:r>
-    </w:p>
-    <w:p/>
+      <w:r>
+        <w:rPr>
+          <w:sz w:val="24"/>
+          <w:szCs w:val="24"/>
+        </w:rPr>
+        <w:t>Jugendliche/ Lese</w:t>
+      </w:r>
+      <w:r>
+        <w:rPr>
+          <w:sz w:val="24"/>
+          <w:szCs w:val="24"/>
+        </w:rPr>
+        <w:t xml:space="preserve"> und Fantasy begeisterte</w:t>
+      </w:r>
+    </w:p>
     <w:sectPr>
       <w:headerReference w:type="default" r:id="rId9"/>
       <w:footerReference w:type="default" r:id="rId10"/>
@@ -788,7 +816,6 @@
         <w:docPartUnique/>
       </w:docPartObj>
     </w:sdtPr>
-    <w:sdtEndPr/>
     <w:sdtContent>
       <w:p>
         <w:pPr>
@@ -1706,6 +1733,7 @@
   <w:style w:type="character" w:default="1" w:styleId="Absatz-Standardschriftart">
     <w:name w:val="Default Paragraph Font"/>
     <w:uiPriority w:val="1"/>
+    <w:semiHidden/>
     <w:unhideWhenUsed/>
   </w:style>
   <w:style w:type="table" w:default="1" w:styleId="NormaleTabelle">

</xml_diff>